<commit_message>
Refresh Soccer Week 2 plan and note Terry Fox Friday
Replace the Sept 14–18 .docx and flag Fri Sept 18 as Terry Fox Day (no gym soccer PE).
</commit_message>
<xml_diff>
--- a/weekly-plans/PE-Weekly-Plan-Sept-14-18-2026-Soccer-Week-2.docx
+++ b/weekly-plans/PE-Weekly-Plan-Sept-14-18-2026-Soccer-Week-2.docx
@@ -13,21 +13,29 @@
     <w:p>
       <w:r>
         <w:rPr>
+          <w:rFonts w:ascii="Calibri" w:hAnsi="Calibri"/>
           <w:b w:val="0"/>
+          <w:sz w:val="22"/>
         </w:rPr>
-        <w:t>Full teaching week (Mon–Fri). Early dismissal Wednesday — keep wu + game tight that day.</w:t>
+        <w:t>Calendar: Fri Sept 18 = Terry Fox Day (Terry Fox Run for all classes — no gym soccer PE). Early dismissal Wednesday — keep wu + game tight. Week 2 soccer teaching days: Mon–Thu only.</w:t>
       </w:r>
     </w:p>
     <w:p>
       <w:r>
         <w:rPr>
+          <w:rFonts w:ascii="Calibri" w:hAnsi="Calibri"/>
           <w:b w:val="0"/>
+          <w:sz w:val="22"/>
         </w:rPr>
         <w:t>Theme: September soccer Week 2 — pass, move, receive, simple 2v1 (SCA PE Playbook)</w:t>
       </w:r>
     </w:p>
     <w:p>
       <w:r>
+        <w:rPr>
+          <w:rFonts w:ascii="Calibri" w:hAnsi="Calibri"/>
+          <w:sz w:val="22"/>
+        </w:rPr>
         <w:t xml:space="preserve">Playbook: </w:t>
       </w:r>
       <w:hyperlink r:id="rId9">
@@ -44,6 +52,10 @@
     </w:p>
     <w:p>
       <w:r>
+        <w:rPr>
+          <w:rFonts w:ascii="Calibri" w:hAnsi="Calibri"/>
+          <w:sz w:val="22"/>
+        </w:rPr>
         <w:t xml:space="preserve">House rules: </w:t>
       </w:r>
       <w:hyperlink r:id="rId10">
@@ -60,6 +72,10 @@
     </w:p>
     <w:p>
       <w:r>
+        <w:rPr>
+          <w:rFonts w:ascii="Calibri" w:hAnsi="Calibri"/>
+          <w:sz w:val="22"/>
+        </w:rPr>
         <w:t xml:space="preserve">September month: </w:t>
       </w:r>
       <w:hyperlink r:id="rId11">
@@ -77,7 +93,9 @@
     <w:p>
       <w:r>
         <w:rPr>
+          <w:rFonts w:ascii="Calibri" w:hAnsi="Calibri"/>
           <w:b w:val="0"/>
+          <w:sz w:val="22"/>
         </w:rPr>
         <w:t>Equipment: Soccer balls, cones/gates, pinnies</w:t>
       </w:r>
@@ -85,7 +103,9 @@
     <w:p>
       <w:r>
         <w:rPr>
+          <w:rFonts w:ascii="Calibri" w:hAnsi="Calibri"/>
           <w:b w:val="0"/>
+          <w:sz w:val="22"/>
         </w:rPr>
         <w:t>House rules: No elimination · soft tag · real soccer balls · teacher-formed teams · ~24 kids moving</w:t>
       </w:r>
@@ -101,7 +121,9 @@
     <w:p>
       <w:r>
         <w:rPr>
+          <w:rFonts w:ascii="Calibri" w:hAnsi="Calibri"/>
           <w:b w:val="0"/>
+          <w:sz w:val="22"/>
         </w:rPr>
         <w:t>Movement Skill Development · Safety · Active Living · Healthy Relationships</w:t>
       </w:r>
@@ -109,7 +131,9 @@
     <w:p>
       <w:r>
         <w:rPr>
+          <w:rFonts w:ascii="Calibri" w:hAnsi="Calibri"/>
           <w:b w:val="0"/>
+          <w:sz w:val="22"/>
         </w:rPr>
         <w:t>(Confirm exact LearnAlberta outcome wording before report cards.)</w:t>
       </w:r>
@@ -127,6 +151,10 @@
         <w:pStyle w:val="ListBullet"/>
       </w:pPr>
       <w:r>
+        <w:rPr>
+          <w:rFonts w:ascii="Calibri" w:hAnsi="Calibri"/>
+          <w:sz w:val="22"/>
+        </w:rPr>
         <w:t>Inside-foot contact; plant foot beside the ball</w:t>
       </w:r>
     </w:p>
@@ -135,6 +163,10 @@
         <w:pStyle w:val="ListBullet"/>
       </w:pPr>
       <w:r>
+        <w:rPr>
+          <w:rFonts w:ascii="Calibri" w:hAnsi="Calibri"/>
+          <w:sz w:val="22"/>
+        </w:rPr>
         <w:t>Move after the pass (do not stand still)</w:t>
       </w:r>
     </w:p>
@@ -143,6 +175,10 @@
         <w:pStyle w:val="ListBullet"/>
       </w:pPr>
       <w:r>
+        <w:rPr>
+          <w:rFonts w:ascii="Calibri" w:hAnsi="Calibri"/>
+          <w:sz w:val="22"/>
+        </w:rPr>
         <w:t>Cushion a receive, then send</w:t>
       </w:r>
     </w:p>
@@ -151,6 +187,10 @@
         <w:pStyle w:val="ListBullet"/>
       </w:pPr>
       <w:r>
+        <w:rPr>
+          <w:rFonts w:ascii="Calibri" w:hAnsi="Calibri"/>
+          <w:sz w:val="22"/>
+        </w:rPr>
         <w:t>Stay-in: stretch / hospital / 10-count, then back</w:t>
       </w:r>
     </w:p>
@@ -165,13 +205,19 @@
     <w:p>
       <w:r>
         <w:rPr>
+          <w:rFonts w:ascii="Calibri" w:hAnsi="Calibri"/>
           <w:b w:val="0"/>
+          <w:sz w:val="22"/>
         </w:rPr>
         <w:t>Click any link for a demo or refresher:</w:t>
       </w:r>
     </w:p>
     <w:p>
       <w:r>
+        <w:rPr>
+          <w:rFonts w:ascii="Calibri" w:hAnsi="Calibri"/>
+          <w:sz w:val="22"/>
+        </w:rPr>
         <w:t xml:space="preserve">Rob the Nest: </w:t>
       </w:r>
       <w:hyperlink r:id="rId12">
@@ -188,6 +234,10 @@
     </w:p>
     <w:p>
       <w:r>
+        <w:rPr>
+          <w:rFonts w:ascii="Calibri" w:hAnsi="Calibri"/>
+          <w:sz w:val="22"/>
+        </w:rPr>
         <w:t xml:space="preserve">4 vs 1: </w:t>
       </w:r>
       <w:hyperlink r:id="rId13">
@@ -204,6 +254,10 @@
     </w:p>
     <w:p>
       <w:r>
+        <w:rPr>
+          <w:rFonts w:ascii="Calibri" w:hAnsi="Calibri"/>
+          <w:sz w:val="22"/>
+        </w:rPr>
         <w:t xml:space="preserve">End Wall Soccer: </w:t>
       </w:r>
       <w:hyperlink r:id="rId14">
@@ -220,6 +274,10 @@
     </w:p>
     <w:p>
       <w:r>
+        <w:rPr>
+          <w:rFonts w:ascii="Calibri" w:hAnsi="Calibri"/>
+          <w:sz w:val="22"/>
+        </w:rPr>
         <w:t xml:space="preserve">Avoid the Mines: </w:t>
       </w:r>
       <w:hyperlink r:id="rId15">
@@ -236,6 +294,10 @@
     </w:p>
     <w:p>
       <w:r>
+        <w:rPr>
+          <w:rFonts w:ascii="Calibri" w:hAnsi="Calibri"/>
+          <w:sz w:val="22"/>
+        </w:rPr>
         <w:t xml:space="preserve">Foosball Soccer: </w:t>
       </w:r>
       <w:hyperlink r:id="rId16">
@@ -252,6 +314,10 @@
     </w:p>
     <w:p>
       <w:r>
+        <w:rPr>
+          <w:rFonts w:ascii="Calibri" w:hAnsi="Calibri"/>
+          <w:sz w:val="22"/>
+        </w:rPr>
         <w:t xml:space="preserve">Knock ’em Downers: </w:t>
       </w:r>
       <w:hyperlink r:id="rId17">
@@ -268,6 +334,10 @@
     </w:p>
     <w:p>
       <w:r>
+        <w:rPr>
+          <w:rFonts w:ascii="Calibri" w:hAnsi="Calibri"/>
+          <w:sz w:val="22"/>
+        </w:rPr>
         <w:t xml:space="preserve">PhysEdGames channel: </w:t>
       </w:r>
       <w:hyperlink r:id="rId18">
@@ -284,6 +354,10 @@
     </w:p>
     <w:p>
       <w:r>
+        <w:rPr>
+          <w:rFonts w:ascii="Calibri" w:hAnsi="Calibri"/>
+          <w:sz w:val="22"/>
+        </w:rPr>
         <w:t xml:space="preserve">Prime Coaching Sport: </w:t>
       </w:r>
       <w:hyperlink r:id="rId19">
@@ -300,6 +374,10 @@
     </w:p>
     <w:p>
       <w:r>
+        <w:rPr>
+          <w:rFonts w:ascii="Calibri" w:hAnsi="Calibri"/>
+          <w:sz w:val="22"/>
+        </w:rPr>
         <w:t xml:space="preserve">Coach Gelardi: </w:t>
       </w:r>
       <w:hyperlink r:id="rId20">
@@ -325,7 +403,9 @@
     <w:p>
       <w:r>
         <w:rPr>
-          <w:b/>
+          <w:rFonts w:ascii="Calibri" w:hAnsi="Calibri"/>
+          <w:b w:val="0"/>
+          <w:sz w:val="22"/>
         </w:rPr>
         <w:t>Focus: Soft pass, walk to space, hands OK on receive</w:t>
       </w:r>
@@ -333,7 +413,9 @@
     <w:p>
       <w:r>
         <w:rPr>
+          <w:rFonts w:ascii="Calibri" w:hAnsi="Calibri"/>
           <w:b/>
+          <w:sz w:val="22"/>
         </w:rPr>
         <w:t>Day 1 · Mon · Inside-foot pass</w:t>
       </w:r>
@@ -341,7 +423,9 @@
     <w:p>
       <w:r>
         <w:rPr>
+          <w:rFonts w:ascii="Calibri" w:hAnsi="Calibri"/>
           <w:b w:val="0"/>
+          <w:sz w:val="22"/>
         </w:rPr>
         <w:t>wu: Partner bump-pass (walk).</w:t>
       </w:r>
@@ -349,7 +433,9 @@
     <w:p>
       <w:r>
         <w:rPr>
+          <w:rFonts w:ascii="Calibri" w:hAnsi="Calibri"/>
           <w:b w:val="0"/>
+          <w:sz w:val="22"/>
         </w:rPr>
         <w:t>skill: Gate passing — plant foot beside the ball; accuracy over power.</w:t>
       </w:r>
@@ -357,7 +443,9 @@
     <w:p>
       <w:r>
         <w:rPr>
+          <w:rFonts w:ascii="Calibri" w:hAnsi="Calibri"/>
           <w:b w:val="0"/>
+          <w:sz w:val="22"/>
         </w:rPr>
         <w:t>game: Keep-away 3v0 (no defender) in a small square; rotate.</w:t>
       </w:r>
@@ -365,7 +453,9 @@
     <w:p>
       <w:r>
         <w:rPr>
+          <w:rFonts w:ascii="Calibri" w:hAnsi="Calibri"/>
           <w:b w:val="0"/>
+          <w:sz w:val="22"/>
         </w:rPr>
         <w:t>cd: Accuracy shout-out.</w:t>
       </w:r>
@@ -373,7 +463,8 @@
     <w:p>
       <w:r>
         <w:rPr>
-          <w:b/>
+          <w:rFonts w:ascii="Calibri" w:hAnsi="Calibri"/>
+          <w:sz w:val="22"/>
         </w:rPr>
         <w:t xml:space="preserve">Links: </w:t>
       </w:r>
@@ -389,6 +480,10 @@
         </w:r>
       </w:hyperlink>
       <w:r>
+        <w:rPr>
+          <w:rFonts w:ascii="Calibri" w:hAnsi="Calibri"/>
+          <w:sz w:val="22"/>
+        </w:rPr>
         <w:t xml:space="preserve"> · </w:t>
       </w:r>
       <w:hyperlink r:id="rId13">
@@ -406,7 +501,9 @@
     <w:p>
       <w:r>
         <w:rPr>
+          <w:rFonts w:ascii="Calibri" w:hAnsi="Calibri"/>
           <w:b/>
+          <w:sz w:val="22"/>
         </w:rPr>
         <w:t>Day 2 · Tue · Move after you pass</w:t>
       </w:r>
@@ -414,7 +511,9 @@
     <w:p>
       <w:r>
         <w:rPr>
+          <w:rFonts w:ascii="Calibri" w:hAnsi="Calibri"/>
           <w:b w:val="0"/>
+          <w:sz w:val="22"/>
         </w:rPr>
         <w:t>wu: Jog and self-tap.</w:t>
       </w:r>
@@ -422,7 +521,9 @@
     <w:p>
       <w:r>
         <w:rPr>
+          <w:rFonts w:ascii="Calibri" w:hAnsi="Calibri"/>
           <w:b w:val="0"/>
+          <w:sz w:val="22"/>
         </w:rPr>
         <w:t>skill: Pass, then take three steps to a new cone.</w:t>
       </w:r>
@@ -430,7 +531,9 @@
     <w:p>
       <w:r>
         <w:rPr>
+          <w:rFonts w:ascii="Calibri" w:hAnsi="Calibri"/>
           <w:b w:val="0"/>
+          <w:sz w:val="22"/>
         </w:rPr>
         <w:t>game: Rob the Nest — hands OK to collect; one ball at a time; tag = stretch 10, then back.</w:t>
       </w:r>
@@ -438,7 +541,9 @@
     <w:p>
       <w:r>
         <w:rPr>
+          <w:rFonts w:ascii="Calibri" w:hAnsi="Calibri"/>
           <w:b w:val="0"/>
+          <w:sz w:val="22"/>
         </w:rPr>
         <w:t>cd: Did you stand still after the pass?</w:t>
       </w:r>
@@ -446,7 +551,8 @@
     <w:p>
       <w:r>
         <w:rPr>
-          <w:b/>
+          <w:rFonts w:ascii="Calibri" w:hAnsi="Calibri"/>
+          <w:sz w:val="22"/>
         </w:rPr>
         <w:t xml:space="preserve">Links: </w:t>
       </w:r>
@@ -465,7 +571,9 @@
     <w:p>
       <w:r>
         <w:rPr>
+          <w:rFonts w:ascii="Calibri" w:hAnsi="Calibri"/>
           <w:b/>
+          <w:sz w:val="22"/>
         </w:rPr>
         <w:t>Day 3 · Wed (early dismissal) · Receive a moving ball</w:t>
       </w:r>
@@ -473,7 +581,9 @@
     <w:p>
       <w:r>
         <w:rPr>
+          <w:rFonts w:ascii="Calibri" w:hAnsi="Calibri"/>
           <w:b w:val="0"/>
+          <w:sz w:val="22"/>
         </w:rPr>
         <w:t>wu: Teacher rolls; class traps (hands OK).</w:t>
       </w:r>
@@ -481,7 +591,9 @@
     <w:p>
       <w:r>
         <w:rPr>
+          <w:rFonts w:ascii="Calibri" w:hAnsi="Calibri"/>
           <w:b w:val="0"/>
+          <w:sz w:val="22"/>
         </w:rPr>
         <w:t>skill: Trap a partner pass, then return through a wide gate.</w:t>
       </w:r>
@@ -489,7 +601,9 @@
     <w:p>
       <w:r>
         <w:rPr>
+          <w:rFonts w:ascii="Calibri" w:hAnsi="Calibri"/>
           <w:b w:val="0"/>
+          <w:sz w:val="22"/>
         </w:rPr>
         <w:t>game: King of the Court trap — stay in if you trap (miss = 10-count, then back).</w:t>
       </w:r>
@@ -497,7 +611,9 @@
     <w:p>
       <w:r>
         <w:rPr>
+          <w:rFonts w:ascii="Calibri" w:hAnsi="Calibri"/>
           <w:b w:val="0"/>
+          <w:sz w:val="22"/>
         </w:rPr>
         <w:t>cd: Give with the ball.</w:t>
       </w:r>
@@ -505,7 +621,8 @@
     <w:p>
       <w:r>
         <w:rPr>
-          <w:b/>
+          <w:rFonts w:ascii="Calibri" w:hAnsi="Calibri"/>
+          <w:sz w:val="22"/>
         </w:rPr>
         <w:t xml:space="preserve">Links: </w:t>
       </w:r>
@@ -524,7 +641,9 @@
     <w:p>
       <w:r>
         <w:rPr>
+          <w:rFonts w:ascii="Calibri" w:hAnsi="Calibri"/>
           <w:b/>
+          <w:sz w:val="22"/>
         </w:rPr>
         <w:t>Day 4 · Thu · 2v1 to a gate (no defender first)</w:t>
       </w:r>
@@ -532,7 +651,9 @@
     <w:p>
       <w:r>
         <w:rPr>
+          <w:rFonts w:ascii="Calibri" w:hAnsi="Calibri"/>
           <w:b w:val="0"/>
+          <w:sz w:val="22"/>
         </w:rPr>
         <w:t>wu: Dribble tag (walk) — Hospital Tag style, then back in.</w:t>
       </w:r>
@@ -540,7 +661,9 @@
     <w:p>
       <w:r>
         <w:rPr>
+          <w:rFonts w:ascii="Calibri" w:hAnsi="Calibri"/>
           <w:b w:val="0"/>
+          <w:sz w:val="22"/>
         </w:rPr>
         <w:t>game/skill: Two attackers to a gate; no defender. Pass before the gate.</w:t>
       </w:r>
@@ -548,7 +671,9 @@
     <w:p>
       <w:r>
         <w:rPr>
+          <w:rFonts w:ascii="Calibri" w:hAnsi="Calibri"/>
           <w:b w:val="0"/>
+          <w:sz w:val="22"/>
         </w:rPr>
         <w:t>cd: Hands to yourself.</w:t>
       </w:r>
@@ -556,7 +681,8 @@
     <w:p>
       <w:r>
         <w:rPr>
-          <w:b/>
+          <w:rFonts w:ascii="Calibri" w:hAnsi="Calibri"/>
+          <w:sz w:val="22"/>
         </w:rPr>
         <w:t xml:space="preserve">Links: </w:t>
       </w:r>
@@ -575,60 +701,51 @@
     <w:p>
       <w:r>
         <w:rPr>
+          <w:rFonts w:ascii="Calibri" w:hAnsi="Calibri"/>
           <w:b/>
+          <w:sz w:val="22"/>
         </w:rPr>
-        <w:t>Day 5 · Fri · End-zone closer</w:t>
+        <w:t>Day 5 · Fri · Terry Fox Run (school event)</w:t>
       </w:r>
     </w:p>
     <w:p>
       <w:r>
         <w:rPr>
+          <w:rFonts w:ascii="Calibri" w:hAnsi="Calibri"/>
           <w:b w:val="0"/>
+          <w:sz w:val="22"/>
         </w:rPr>
-        <w:t>wu: Free trap.</w:t>
+        <w:t>No gym soccer lesson today. PE is the Terry Fox Run / school Terry Fox activities for all classes.</w:t>
       </w:r>
     </w:p>
     <w:p>
       <w:r>
         <w:rPr>
+          <w:rFonts w:ascii="Calibri" w:hAnsi="Calibri"/>
           <w:b w:val="0"/>
+          <w:sz w:val="22"/>
         </w:rPr>
-        <w:t>skill/game: End-zone soccer — three passes to score (no defender).</w:t>
+        <w:t>Optional: brief class huddle before/after the run (kind effort, community, finish together) — not a soccer skill block.</w:t>
       </w:r>
     </w:p>
     <w:p>
       <w:r>
         <w:rPr>
+          <w:rFonts w:ascii="Calibri" w:hAnsi="Calibri"/>
           <w:b w:val="0"/>
+          <w:sz w:val="22"/>
         </w:rPr>
-        <w:t>cd: Handshake line.</w:t>
+        <w:t>cd: Celebrate participation / class cheer.</w:t>
       </w:r>
     </w:p>
     <w:p>
       <w:r>
         <w:rPr>
-          <w:b/>
+          <w:rFonts w:ascii="Calibri" w:hAnsi="Calibri"/>
+          <w:b w:val="0"/>
+          <w:sz w:val="22"/>
         </w:rPr>
-        <w:t xml:space="preserve">Links: </w:t>
-      </w:r>
-      <w:hyperlink r:id="rId14">
-        <w:r>
-          <w:rPr>
-            <w:color w:val="0563C1"/>
-            <w:u w:val="single"/>
-            <w:sz w:val="22"/>
-            <w:rFonts w:ascii="Calibri" w:hAnsi="Calibri"/>
-          </w:rPr>
-          <w:t>End Wall Soccer</w:t>
-        </w:r>
-      </w:hyperlink>
-    </w:p>
-    <w:p>
-      <w:r>
-        <w:rPr>
-          <w:b w:val="0"/>
-        </w:rPr>
-        <w:t>Look-fors (1–2): walk pace, hands OK on trap, wide gates, 3v0.</w:t>
+        <w:t>Look-fors (1–2): walk pace, hands OK on trap, wide gates, 3v0. (Mon–Thu soccer days only.)</w:t>
       </w:r>
     </w:p>
     <w:p>
@@ -642,7 +759,9 @@
     <w:p>
       <w:r>
         <w:rPr>
-          <w:b/>
+          <w:rFonts w:ascii="Calibri" w:hAnsi="Calibri"/>
+          <w:b w:val="0"/>
+          <w:sz w:val="22"/>
         </w:rPr>
         <w:t>Focus: Feet-only pass/receive, 3v1, move after pass</w:t>
       </w:r>
@@ -650,7 +769,9 @@
     <w:p>
       <w:r>
         <w:rPr>
+          <w:rFonts w:ascii="Calibri" w:hAnsi="Calibri"/>
           <w:b/>
+          <w:sz w:val="22"/>
         </w:rPr>
         <w:t>Day 1 · Mon · Inside-foot pass</w:t>
       </w:r>
@@ -658,7 +779,9 @@
     <w:p>
       <w:r>
         <w:rPr>
+          <w:rFonts w:ascii="Calibri" w:hAnsi="Calibri"/>
           <w:b w:val="0"/>
+          <w:sz w:val="22"/>
         </w:rPr>
         <w:t>wu: Partner bump-pass.</w:t>
       </w:r>
@@ -666,7 +789,9 @@
     <w:p>
       <w:r>
         <w:rPr>
+          <w:rFonts w:ascii="Calibri" w:hAnsi="Calibri"/>
           <w:b w:val="0"/>
+          <w:sz w:val="22"/>
         </w:rPr>
         <w:t>skill: Gate passing; plant foot beside the ball.</w:t>
       </w:r>
@@ -674,7 +799,9 @@
     <w:p>
       <w:r>
         <w:rPr>
+          <w:rFonts w:ascii="Calibri" w:hAnsi="Calibri"/>
           <w:b w:val="0"/>
+          <w:sz w:val="22"/>
         </w:rPr>
         <w:t>game: Keep-away 3v1 in a small square (rotate the 1). Tag/out = stretch 10, then back.</w:t>
       </w:r>
@@ -682,7 +809,9 @@
     <w:p>
       <w:r>
         <w:rPr>
+          <w:rFonts w:ascii="Calibri" w:hAnsi="Calibri"/>
           <w:b w:val="0"/>
+          <w:sz w:val="22"/>
         </w:rPr>
         <w:t>cd: Accuracy shout-out.</w:t>
       </w:r>
@@ -690,7 +819,8 @@
     <w:p>
       <w:r>
         <w:rPr>
-          <w:b/>
+          <w:rFonts w:ascii="Calibri" w:hAnsi="Calibri"/>
+          <w:sz w:val="22"/>
         </w:rPr>
         <w:t xml:space="preserve">Links: </w:t>
       </w:r>
@@ -706,6 +836,10 @@
         </w:r>
       </w:hyperlink>
       <w:r>
+        <w:rPr>
+          <w:rFonts w:ascii="Calibri" w:hAnsi="Calibri"/>
+          <w:sz w:val="22"/>
+        </w:rPr>
         <w:t xml:space="preserve"> · </w:t>
       </w:r>
       <w:hyperlink r:id="rId11">
@@ -723,7 +857,9 @@
     <w:p>
       <w:r>
         <w:rPr>
+          <w:rFonts w:ascii="Calibri" w:hAnsi="Calibri"/>
           <w:b/>
+          <w:sz w:val="22"/>
         </w:rPr>
         <w:t>Day 2 · Tue · Move after you pass</w:t>
       </w:r>
@@ -731,7 +867,9 @@
     <w:p>
       <w:r>
         <w:rPr>
+          <w:rFonts w:ascii="Calibri" w:hAnsi="Calibri"/>
           <w:b w:val="0"/>
+          <w:sz w:val="22"/>
         </w:rPr>
         <w:t>wu: Jog and self-tap.</w:t>
       </w:r>
@@ -739,7 +877,9 @@
     <w:p>
       <w:r>
         <w:rPr>
+          <w:rFonts w:ascii="Calibri" w:hAnsi="Calibri"/>
           <w:b w:val="0"/>
+          <w:sz w:val="22"/>
         </w:rPr>
         <w:t>skill: Pass, then three steps to a new cone.</w:t>
       </w:r>
@@ -747,7 +887,9 @@
     <w:p>
       <w:r>
         <w:rPr>
+          <w:rFonts w:ascii="Calibri" w:hAnsi="Calibri"/>
           <w:b w:val="0"/>
+          <w:sz w:val="22"/>
         </w:rPr>
         <w:t>game: Rob the Nest — feet only; may steal; tag = stretch, then back.</w:t>
       </w:r>
@@ -755,7 +897,9 @@
     <w:p>
       <w:r>
         <w:rPr>
+          <w:rFonts w:ascii="Calibri" w:hAnsi="Calibri"/>
           <w:b w:val="0"/>
+          <w:sz w:val="22"/>
         </w:rPr>
         <w:t>cd: Did you stand still after the pass?</w:t>
       </w:r>
@@ -763,7 +907,8 @@
     <w:p>
       <w:r>
         <w:rPr>
-          <w:b/>
+          <w:rFonts w:ascii="Calibri" w:hAnsi="Calibri"/>
+          <w:sz w:val="22"/>
         </w:rPr>
         <w:t xml:space="preserve">Links: </w:t>
       </w:r>
@@ -782,7 +927,9 @@
     <w:p>
       <w:r>
         <w:rPr>
+          <w:rFonts w:ascii="Calibri" w:hAnsi="Calibri"/>
           <w:b/>
+          <w:sz w:val="22"/>
         </w:rPr>
         <w:t>Day 3 · Wed (early dismissal) · Receive a moving ball</w:t>
       </w:r>
@@ -790,7 +937,9 @@
     <w:p>
       <w:r>
         <w:rPr>
+          <w:rFonts w:ascii="Calibri" w:hAnsi="Calibri"/>
           <w:b w:val="0"/>
+          <w:sz w:val="22"/>
         </w:rPr>
         <w:t>wu: Teacher rolls; class traps (feet preferred).</w:t>
       </w:r>
@@ -798,7 +947,9 @@
     <w:p>
       <w:r>
         <w:rPr>
+          <w:rFonts w:ascii="Calibri" w:hAnsi="Calibri"/>
           <w:b w:val="0"/>
+          <w:sz w:val="22"/>
         </w:rPr>
         <w:t>skill: Trap partner pass, return through a gate.</w:t>
       </w:r>
@@ -806,7 +957,9 @@
     <w:p>
       <w:r>
         <w:rPr>
+          <w:rFonts w:ascii="Calibri" w:hAnsi="Calibri"/>
           <w:b w:val="0"/>
+          <w:sz w:val="22"/>
         </w:rPr>
         <w:t>game: King of the Court trap — stay in if you trap.</w:t>
       </w:r>
@@ -814,7 +967,9 @@
     <w:p>
       <w:r>
         <w:rPr>
+          <w:rFonts w:ascii="Calibri" w:hAnsi="Calibri"/>
           <w:b w:val="0"/>
+          <w:sz w:val="22"/>
         </w:rPr>
         <w:t>cd: Give with the ball.</w:t>
       </w:r>
@@ -822,7 +977,8 @@
     <w:p>
       <w:r>
         <w:rPr>
-          <w:b/>
+          <w:rFonts w:ascii="Calibri" w:hAnsi="Calibri"/>
+          <w:sz w:val="22"/>
         </w:rPr>
         <w:t xml:space="preserve">Links: </w:t>
       </w:r>
@@ -841,7 +997,9 @@
     <w:p>
       <w:r>
         <w:rPr>
+          <w:rFonts w:ascii="Calibri" w:hAnsi="Calibri"/>
           <w:b/>
+          <w:sz w:val="22"/>
         </w:rPr>
         <w:t>Day 4 · Thu · 2v1 to a gate</w:t>
       </w:r>
@@ -849,7 +1007,9 @@
     <w:p>
       <w:r>
         <w:rPr>
+          <w:rFonts w:ascii="Calibri" w:hAnsi="Calibri"/>
           <w:b w:val="0"/>
+          <w:sz w:val="22"/>
         </w:rPr>
         <w:t>wu: Dribble tag / Avoid the Mines through cones (no sitting out).</w:t>
       </w:r>
@@ -857,7 +1017,9 @@
     <w:p>
       <w:r>
         <w:rPr>
+          <w:rFonts w:ascii="Calibri" w:hAnsi="Calibri"/>
           <w:b w:val="0"/>
+          <w:sz w:val="22"/>
         </w:rPr>
         <w:t>skill: Two attackers, one passive defender; pass before the gate.</w:t>
       </w:r>
@@ -865,7 +1027,9 @@
     <w:p>
       <w:r>
         <w:rPr>
+          <w:rFonts w:ascii="Calibri" w:hAnsi="Calibri"/>
           <w:b w:val="0"/>
+          <w:sz w:val="22"/>
         </w:rPr>
         <w:t>game: End-zone soccer — three passes to score.</w:t>
       </w:r>
@@ -873,7 +1037,9 @@
     <w:p>
       <w:r>
         <w:rPr>
+          <w:rFonts w:ascii="Calibri" w:hAnsi="Calibri"/>
           <w:b w:val="0"/>
+          <w:sz w:val="22"/>
         </w:rPr>
         <w:t>cd: Hands to yourself.</w:t>
       </w:r>
@@ -881,7 +1047,8 @@
     <w:p>
       <w:r>
         <w:rPr>
-          <w:b/>
+          <w:rFonts w:ascii="Calibri" w:hAnsi="Calibri"/>
+          <w:sz w:val="22"/>
         </w:rPr>
         <w:t xml:space="preserve">Links: </w:t>
       </w:r>
@@ -896,53 +1063,12 @@
           <w:t>Avoid the Mines</w:t>
         </w:r>
       </w:hyperlink>
-    </w:p>
-    <w:p>
       <w:r>
         <w:rPr>
-          <w:b/>
+          <w:rFonts w:ascii="Calibri" w:hAnsi="Calibri"/>
+          <w:sz w:val="22"/>
         </w:rPr>
-        <w:t>Day 5 · Fri · Fair-play closer</w:t>
-      </w:r>
-    </w:p>
-    <w:p>
-      <w:r>
-        <w:rPr>
-          <w:b w:val="0"/>
-        </w:rPr>
-        <w:t>wu: Partner high-five jog.</w:t>
-      </w:r>
-    </w:p>
-    <w:p>
-      <w:r>
-        <w:rPr>
-          <w:b w:val="0"/>
-        </w:rPr>
-        <w:t>skill: Soft contact reminders.</w:t>
-      </w:r>
-    </w:p>
-    <w:p>
-      <w:r>
-        <w:rPr>
-          <w:b w:val="0"/>
-        </w:rPr>
-        <w:t>game: End Wall Soccer or Wall Soccer small-sided; stay-in.</w:t>
-      </w:r>
-    </w:p>
-    <w:p>
-      <w:r>
-        <w:rPr>
-          <w:b w:val="0"/>
-        </w:rPr>
-        <w:t>cd: Handshake line.</w:t>
-      </w:r>
-    </w:p>
-    <w:p>
-      <w:r>
-        <w:rPr>
-          <w:b/>
-        </w:rPr>
-        <w:t xml:space="preserve">Links: </w:t>
+        <w:t xml:space="preserve"> · </w:t>
       </w:r>
       <w:hyperlink r:id="rId14">
         <w:r>
@@ -959,9 +1085,51 @@
     <w:p>
       <w:r>
         <w:rPr>
+          <w:rFonts w:ascii="Calibri" w:hAnsi="Calibri"/>
+          <w:b/>
+          <w:sz w:val="22"/>
+        </w:rPr>
+        <w:t>Day 5 · Fri · Terry Fox Run (school event)</w:t>
+      </w:r>
+    </w:p>
+    <w:p>
+      <w:r>
+        <w:rPr>
+          <w:rFonts w:ascii="Calibri" w:hAnsi="Calibri"/>
           <w:b w:val="0"/>
+          <w:sz w:val="22"/>
         </w:rPr>
-        <w:t>Look-fors (3–4): feet-only, plant foot, move after pass, fair rotate in 3v1.</w:t>
+        <w:t>No gym soccer lesson today. PE is the Terry Fox Run / school Terry Fox activities for all classes.</w:t>
+      </w:r>
+    </w:p>
+    <w:p>
+      <w:r>
+        <w:rPr>
+          <w:rFonts w:ascii="Calibri" w:hAnsi="Calibri"/>
+          <w:b w:val="0"/>
+          <w:sz w:val="22"/>
+        </w:rPr>
+        <w:t>Optional: brief class huddle before/after the run (effort, community) — not a soccer skill block.</w:t>
+      </w:r>
+    </w:p>
+    <w:p>
+      <w:r>
+        <w:rPr>
+          <w:rFonts w:ascii="Calibri" w:hAnsi="Calibri"/>
+          <w:b w:val="0"/>
+          <w:sz w:val="22"/>
+        </w:rPr>
+        <w:t>cd: Celebrate participation / class cheer.</w:t>
+      </w:r>
+    </w:p>
+    <w:p>
+      <w:r>
+        <w:rPr>
+          <w:rFonts w:ascii="Calibri" w:hAnsi="Calibri"/>
+          <w:b w:val="0"/>
+          <w:sz w:val="22"/>
+        </w:rPr>
+        <w:t>Look-fors (3–4): feet-only, plant foot, move after pass, fair rotate in 3v1. (Mon–Thu soccer days only.)</w:t>
       </w:r>
     </w:p>
     <w:p>
@@ -975,7 +1143,9 @@
     <w:p>
       <w:r>
         <w:rPr>
-          <w:b/>
+          <w:rFonts w:ascii="Calibri" w:hAnsi="Calibri"/>
+          <w:b w:val="0"/>
+          <w:sz w:val="22"/>
         </w:rPr>
         <w:t>Focus: Weaker foot, 4v2, active intercept, leadership</w:t>
       </w:r>
@@ -983,7 +1153,9 @@
     <w:p>
       <w:r>
         <w:rPr>
+          <w:rFonts w:ascii="Calibri" w:hAnsi="Calibri"/>
           <w:b/>
+          <w:sz w:val="22"/>
         </w:rPr>
         <w:t>Day 1 · Mon · Inside-foot pass (+ weaker foot)</w:t>
       </w:r>
@@ -991,7 +1163,9 @@
     <w:p>
       <w:r>
         <w:rPr>
+          <w:rFonts w:ascii="Calibri" w:hAnsi="Calibri"/>
           <w:b w:val="0"/>
+          <w:sz w:val="22"/>
         </w:rPr>
         <w:t>wu: Partner bump-pass; weaker foot once each.</w:t>
       </w:r>
@@ -999,7 +1173,9 @@
     <w:p>
       <w:r>
         <w:rPr>
+          <w:rFonts w:ascii="Calibri" w:hAnsi="Calibri"/>
           <w:b w:val="0"/>
+          <w:sz w:val="22"/>
         </w:rPr>
         <w:t>skill: Gate passing; one-touch trap-pass if ready.</w:t>
       </w:r>
@@ -1007,7 +1183,9 @@
     <w:p>
       <w:r>
         <w:rPr>
+          <w:rFonts w:ascii="Calibri" w:hAnsi="Calibri"/>
           <w:b w:val="0"/>
+          <w:sz w:val="22"/>
         </w:rPr>
         <w:t>game: Keep-away 4v2; rotate defenders every 45s. Stretch then back — no sit-out.</w:t>
       </w:r>
@@ -1015,7 +1193,9 @@
     <w:p>
       <w:r>
         <w:rPr>
+          <w:rFonts w:ascii="Calibri" w:hAnsi="Calibri"/>
           <w:b w:val="0"/>
+          <w:sz w:val="22"/>
         </w:rPr>
         <w:t>cd: Name one cue that helped a teammate.</w:t>
       </w:r>
@@ -1023,7 +1203,8 @@
     <w:p>
       <w:r>
         <w:rPr>
-          <w:b/>
+          <w:rFonts w:ascii="Calibri" w:hAnsi="Calibri"/>
+          <w:sz w:val="22"/>
         </w:rPr>
         <w:t xml:space="preserve">Links: </w:t>
       </w:r>
@@ -1042,7 +1223,9 @@
     <w:p>
       <w:r>
         <w:rPr>
+          <w:rFonts w:ascii="Calibri" w:hAnsi="Calibri"/>
           <w:b/>
+          <w:sz w:val="22"/>
         </w:rPr>
         <w:t>Day 2 · Tue · Move after you pass</w:t>
       </w:r>
@@ -1050,7 +1233,9 @@
     <w:p>
       <w:r>
         <w:rPr>
+          <w:rFonts w:ascii="Calibri" w:hAnsi="Calibri"/>
           <w:b w:val="0"/>
+          <w:sz w:val="22"/>
         </w:rPr>
         <w:t>wu: Jog and self-tap.</w:t>
       </w:r>
@@ -1058,7 +1243,9 @@
     <w:p>
       <w:r>
         <w:rPr>
+          <w:rFonts w:ascii="Calibri" w:hAnsi="Calibri"/>
           <w:b w:val="0"/>
+          <w:sz w:val="22"/>
         </w:rPr>
         <w:t>skill: Pass, then three steps to a new cone (weaker-foot round once).</w:t>
       </w:r>
@@ -1066,7 +1253,9 @@
     <w:p>
       <w:r>
         <w:rPr>
+          <w:rFonts w:ascii="Calibri" w:hAnsi="Calibri"/>
           <w:b w:val="0"/>
+          <w:sz w:val="22"/>
         </w:rPr>
         <w:t>game: Rob the Nest — feet only; steal OK; tag = stretch, then back.</w:t>
       </w:r>
@@ -1074,7 +1263,9 @@
     <w:p>
       <w:r>
         <w:rPr>
+          <w:rFonts w:ascii="Calibri" w:hAnsi="Calibri"/>
           <w:b w:val="0"/>
+          <w:sz w:val="22"/>
         </w:rPr>
         <w:t>cd: Did you stand still after the pass?</w:t>
       </w:r>
@@ -1082,7 +1273,8 @@
     <w:p>
       <w:r>
         <w:rPr>
-          <w:b/>
+          <w:rFonts w:ascii="Calibri" w:hAnsi="Calibri"/>
+          <w:sz w:val="22"/>
         </w:rPr>
         <w:t xml:space="preserve">Links: </w:t>
       </w:r>
@@ -1101,7 +1293,9 @@
     <w:p>
       <w:r>
         <w:rPr>
+          <w:rFonts w:ascii="Calibri" w:hAnsi="Calibri"/>
           <w:b/>
+          <w:sz w:val="22"/>
         </w:rPr>
         <w:t>Day 3 · Wed (early dismissal) · Receive a moving ball</w:t>
       </w:r>
@@ -1109,7 +1303,9 @@
     <w:p>
       <w:r>
         <w:rPr>
+          <w:rFonts w:ascii="Calibri" w:hAnsi="Calibri"/>
           <w:b w:val="0"/>
+          <w:sz w:val="22"/>
         </w:rPr>
         <w:t>wu: Free trap.</w:t>
       </w:r>
@@ -1117,7 +1313,9 @@
     <w:p>
       <w:r>
         <w:rPr>
+          <w:rFonts w:ascii="Calibri" w:hAnsi="Calibri"/>
           <w:b w:val="0"/>
+          <w:sz w:val="22"/>
         </w:rPr>
         <w:t>skill: One-touch trap-pass through a gate.</w:t>
       </w:r>
@@ -1125,7 +1323,9 @@
     <w:p>
       <w:r>
         <w:rPr>
+          <w:rFonts w:ascii="Calibri" w:hAnsi="Calibri"/>
           <w:b w:val="0"/>
+          <w:sz w:val="22"/>
         </w:rPr>
         <w:t>game: King of the Court trap — stay in if you trap.</w:t>
       </w:r>
@@ -1133,7 +1333,9 @@
     <w:p>
       <w:r>
         <w:rPr>
+          <w:rFonts w:ascii="Calibri" w:hAnsi="Calibri"/>
           <w:b w:val="0"/>
+          <w:sz w:val="22"/>
         </w:rPr>
         <w:t>cd: Give with the ball.</w:t>
       </w:r>
@@ -1141,7 +1343,8 @@
     <w:p>
       <w:r>
         <w:rPr>
-          <w:b/>
+          <w:rFonts w:ascii="Calibri" w:hAnsi="Calibri"/>
+          <w:sz w:val="22"/>
         </w:rPr>
         <w:t xml:space="preserve">Links: </w:t>
       </w:r>
@@ -1160,7 +1363,9 @@
     <w:p>
       <w:r>
         <w:rPr>
+          <w:rFonts w:ascii="Calibri" w:hAnsi="Calibri"/>
           <w:b/>
+          <w:sz w:val="22"/>
         </w:rPr>
         <w:t>Day 4 · Thu · 2v1 / end-zone</w:t>
       </w:r>
@@ -1168,7 +1373,9 @@
     <w:p>
       <w:r>
         <w:rPr>
+          <w:rFonts w:ascii="Calibri" w:hAnsi="Calibri"/>
           <w:b w:val="0"/>
+          <w:sz w:val="22"/>
         </w:rPr>
         <w:t>wu: Avoid the Mines dribble (weaker foot option).</w:t>
       </w:r>
@@ -1176,7 +1383,9 @@
     <w:p>
       <w:r>
         <w:rPr>
+          <w:rFonts w:ascii="Calibri" w:hAnsi="Calibri"/>
           <w:b w:val="0"/>
+          <w:sz w:val="22"/>
         </w:rPr>
         <w:t>skill: Two attackers, one active intercept; pass before the gate.</w:t>
       </w:r>
@@ -1184,7 +1393,9 @@
     <w:p>
       <w:r>
         <w:rPr>
+          <w:rFonts w:ascii="Calibri" w:hAnsi="Calibri"/>
           <w:b w:val="0"/>
+          <w:sz w:val="22"/>
         </w:rPr>
         <w:t>game: End-zone soccer — three passes to score.</w:t>
       </w:r>
@@ -1192,7 +1403,9 @@
     <w:p>
       <w:r>
         <w:rPr>
+          <w:rFonts w:ascii="Calibri" w:hAnsi="Calibri"/>
           <w:b w:val="0"/>
+          <w:sz w:val="22"/>
         </w:rPr>
         <w:t>cd: Hands to yourself.</w:t>
       </w:r>
@@ -1200,7 +1413,8 @@
     <w:p>
       <w:r>
         <w:rPr>
-          <w:b/>
+          <w:rFonts w:ascii="Calibri" w:hAnsi="Calibri"/>
+          <w:sz w:val="22"/>
         </w:rPr>
         <w:t xml:space="preserve">Links: </w:t>
       </w:r>
@@ -1215,53 +1429,12 @@
           <w:t>Avoid the Mines</w:t>
         </w:r>
       </w:hyperlink>
-    </w:p>
-    <w:p>
       <w:r>
         <w:rPr>
-          <w:b/>
+          <w:rFonts w:ascii="Calibri" w:hAnsi="Calibri"/>
+          <w:sz w:val="22"/>
         </w:rPr>
-        <w:t>Day 5 · Fri · End Wall Soccer closer</w:t>
-      </w:r>
-    </w:p>
-    <w:p>
-      <w:r>
-        <w:rPr>
-          <w:b w:val="0"/>
-        </w:rPr>
-        <w:t>wu: Partner high-five jog, ball hugged in.</w:t>
-      </w:r>
-    </w:p>
-    <w:p>
-      <w:r>
-        <w:rPr>
-          <w:b w:val="0"/>
-        </w:rPr>
-        <w:t>skill: Class soccer promises (below knee, no slide).</w:t>
-      </w:r>
-    </w:p>
-    <w:p>
-      <w:r>
-        <w:rPr>
-          <w:b w:val="0"/>
-        </w:rPr>
-        <w:t>game: End Wall Soccer / Wall Soccer; student refs; stay-in.</w:t>
-      </w:r>
-    </w:p>
-    <w:p>
-      <w:r>
-        <w:rPr>
-          <w:b w:val="0"/>
-        </w:rPr>
-        <w:t>cd: Handshake line.</w:t>
-      </w:r>
-    </w:p>
-    <w:p>
-      <w:r>
-        <w:rPr>
-          <w:b/>
-        </w:rPr>
-        <w:t xml:space="preserve">Links: </w:t>
+        <w:t xml:space="preserve"> · </w:t>
       </w:r>
       <w:hyperlink r:id="rId14">
         <w:r>
@@ -1278,9 +1451,51 @@
     <w:p>
       <w:r>
         <w:rPr>
+          <w:rFonts w:ascii="Calibri" w:hAnsi="Calibri"/>
+          <w:b/>
+          <w:sz w:val="22"/>
+        </w:rPr>
+        <w:t>Day 5 · Fri · Terry Fox Run (school event)</w:t>
+      </w:r>
+    </w:p>
+    <w:p>
+      <w:r>
+        <w:rPr>
+          <w:rFonts w:ascii="Calibri" w:hAnsi="Calibri"/>
           <w:b w:val="0"/>
+          <w:sz w:val="22"/>
         </w:rPr>
-        <w:t>Look-fors (5–6): weaker foot, move after pass, active intercept, peer cues.</w:t>
+        <w:t>No gym soccer lesson today. PE is the Terry Fox Run / school Terry Fox activities for all classes.</w:t>
+      </w:r>
+    </w:p>
+    <w:p>
+      <w:r>
+        <w:rPr>
+          <w:rFonts w:ascii="Calibri" w:hAnsi="Calibri"/>
+          <w:b w:val="0"/>
+          <w:sz w:val="22"/>
+        </w:rPr>
+        <w:t>Optional: student leaders help with pace groups / cheering — not a soccer skill block.</w:t>
+      </w:r>
+    </w:p>
+    <w:p>
+      <w:r>
+        <w:rPr>
+          <w:rFonts w:ascii="Calibri" w:hAnsi="Calibri"/>
+          <w:b w:val="0"/>
+          <w:sz w:val="22"/>
+        </w:rPr>
+        <w:t>cd: Celebrate participation / class cheer.</w:t>
+      </w:r>
+    </w:p>
+    <w:p>
+      <w:r>
+        <w:rPr>
+          <w:rFonts w:ascii="Calibri" w:hAnsi="Calibri"/>
+          <w:b w:val="0"/>
+          <w:sz w:val="22"/>
+        </w:rPr>
+        <w:t>Look-fors (5–6): weaker foot, move after pass, active intercept, peer cues. (Mon–Thu soccer days only.)</w:t>
       </w:r>
     </w:p>
     <w:p>
@@ -1294,9 +1509,11 @@
     <w:p>
       <w:r>
         <w:rPr>
+          <w:rFonts w:ascii="Calibri" w:hAnsi="Calibri"/>
           <w:b w:val="0"/>
+          <w:sz w:val="22"/>
         </w:rPr>
-        <w:t>Keep wu + game only; skip the skill station. Still do the cool-down sentence.</w:t>
+        <w:t>Keep wu + game only; skip the skill station. Still do the cool-down sentence. (Applies Mon–Thu; Fri is Terry Fox Run.)</w:t>
       </w:r>
     </w:p>
     <w:p>
@@ -1310,7 +1527,9 @@
     <w:p>
       <w:r>
         <w:rPr>
+          <w:rFonts w:ascii="Calibri" w:hAnsi="Calibri"/>
           <w:b w:val="0"/>
+          <w:sz w:val="22"/>
         </w:rPr>
         <w:t>wu = warm-up · cd = cool-down. Matches SCA PE Playbook Week 2; does not replace website lessons.</w:t>
       </w:r>
@@ -1318,14 +1537,16 @@
     <w:p>
       <w:r>
         <w:rPr>
+          <w:rFonts w:ascii="Calibri" w:hAnsi="Calibri"/>
           <w:b w:val="0"/>
+          <w:sz w:val="22"/>
         </w:rPr>
-        <w:t>Next week (Sept 21–25): football intro per year map. Calendar bump: Wed Sept 30 = Truth &amp; Reconciliation (no school).</w:t>
+        <w:t>Fri Sept 18 = Terry Fox Day — no regular soccer PE. Next week (Sept 21–25): football intro per year map. Calendar bump: Wed Sept 30 = Truth &amp; Reconciliation (no school).</w:t>
       </w:r>
     </w:p>
     <w:sectPr>
       <w:pgSz w:w="12240" w:h="15840"/>
-      <w:pgMar w:top="1440" w:right="1800" w:bottom="1440" w:left="1800" w:header="720" w:footer="720" w:gutter="0"/>
+      <w:pgMar w:top="1440" w:right="1620" w:bottom="1440" w:left="1620" w:header="720" w:footer="720" w:gutter="0"/>
       <w:cols w:space="720"/>
       <w:docGrid w:linePitch="360"/>
     </w:sectPr>

</xml_diff>